<commit_message>
Update internship date to Jul-Sep 2026 in CV and PDF
</commit_message>
<xml_diff>
--- a/Samuel_Leeming_CV.docx
+++ b/Samuel_Leeming_CV.docx
@@ -737,7 +737,7 @@
           <w:color w:val="666666"/>
         </w:rPr>
         <w:tab/>
-        <w:t xml:space="preserve">Jul 2025 </w:t>
+        <w:t xml:space="preserve">Jul 2026 </w:t>
       </w:r>
       <w:r>
         <w:rPr>
@@ -751,7 +751,7 @@
           <w:rFonts w:asciiTheme="minorHAnsi" w:hAnsiTheme="minorHAnsi"/>
           <w:color w:val="666666"/>
         </w:rPr>
-        <w:t xml:space="preserve"> Sep 2025</w:t>
+        <w:t xml:space="preserve"> Sep 2026</w:t>
       </w:r>
     </w:p>
     <w:p>

</xml_diff>